<commit_message>
Correción en la población
</commit_message>
<xml_diff>
--- a/Protocolo PRISMA/Bítacora_revision_sistematica.docx
+++ b/Protocolo PRISMA/Bítacora_revision_sistematica.docx
@@ -1530,27 +1530,7 @@
           <w:sz w:val="20"/>
           <w:szCs w:val="20"/>
         </w:rPr>
-        <w:t xml:space="preserve"> metodológico que transforme las matrices de atención de modelos </w:t>
-      </w:r>
-      <w:proofErr w:type="spellStart"/>
-      <w:r>
-        <w:rPr>
-          <w:rFonts w:ascii="Times New Roman" w:hAnsi="Times New Roman" w:cs="Times New Roman"/>
-          <w:color w:val="auto"/>
-          <w:sz w:val="20"/>
-          <w:szCs w:val="20"/>
-        </w:rPr>
-        <w:t>Transformer</w:t>
-      </w:r>
-      <w:proofErr w:type="spellEnd"/>
-      <w:r>
-        <w:rPr>
-          <w:rFonts w:ascii="Times New Roman" w:hAnsi="Times New Roman" w:cs="Times New Roman"/>
-          <w:color w:val="auto"/>
-          <w:sz w:val="20"/>
-          <w:szCs w:val="20"/>
-        </w:rPr>
-        <w:t xml:space="preserve"> en grafos dirigidos compactos, capaces de generar hipótesis relacionales reproducibles y falsables, con mayor fidelidad al comportamiento del modelo que las técnicas tradicionales de </w:t>
+        <w:t xml:space="preserve"> metodológico que transforme las matrices de atención de modelos de aprendizaje profundo en grafos dirigidos compactos, capaces de generar hipótesis relacionales reproducibles y falsables, con mayor fidelidad al comportamiento del modelo que las técnicas tradicionales de </w:t>
       </w:r>
       <w:proofErr w:type="spellStart"/>
       <w:r>
@@ -1642,27 +1622,7 @@
           <w:sz w:val="20"/>
           <w:szCs w:val="20"/>
         </w:rPr>
-        <w:t xml:space="preserve">Modelos de aprendizaje profundo basados en la arquitectura </w:t>
-      </w:r>
-      <w:proofErr w:type="spellStart"/>
-      <w:r>
-        <w:rPr>
-          <w:rFonts w:ascii="Times New Roman" w:hAnsi="Times New Roman" w:cs="Times New Roman"/>
-          <w:color w:val="auto"/>
-          <w:sz w:val="20"/>
-          <w:szCs w:val="20"/>
-        </w:rPr>
-        <w:t>Transformer</w:t>
-      </w:r>
-      <w:proofErr w:type="spellEnd"/>
-      <w:r>
-        <w:rPr>
-          <w:rFonts w:ascii="Times New Roman" w:hAnsi="Times New Roman" w:cs="Times New Roman"/>
-          <w:color w:val="auto"/>
-          <w:sz w:val="20"/>
-          <w:szCs w:val="20"/>
-        </w:rPr>
-        <w:t>, específicamente aquellos donde la atención se calcula entre tokens que representan variables con significado físico.</w:t>
+        <w:t>Modelos de aprendizaje profundo cuya representación interna produce una matriz de atención, específicamente aquellos donde esa atención se calcula entre tokens que representan variables con significado físico.</w:t>
       </w:r>
       <w:r>
         <w:rPr>
@@ -2614,7 +2574,18 @@
           <w:szCs w:val="20"/>
           <w:lang w:val="en-US"/>
         </w:rPr>
-        <w:t>"black box" OR "black-box" OR "model opacity" OR "opacity" OR "attention instability" OR "instability" OR "seed variability" OR "seed" OR "variability" OR "stochasticity" OR "spurious shortcuts" OR "shortcut learning" OR "spurious correlation" OR "Clever Hans" OR "uninterpretable" OR "</w:t>
+        <w:t xml:space="preserve">"black box" OR "black-box" OR "model opacity" OR "opacity" OR "attention instability" OR "instability" OR "seed variability" OR "seed" OR "variability" OR "stochasticity" OR "spurious shortcuts" </w:t>
+      </w:r>
+      <w:r>
+        <w:rPr>
+          <w:rFonts w:ascii="Times New Roman" w:hAnsi="Times New Roman" w:cs="Times New Roman"/>
+          <w:color w:val="auto"/>
+          <w:sz w:val="20"/>
+          <w:szCs w:val="20"/>
+          <w:lang w:val="en-US"/>
+        </w:rPr>
+        <w:lastRenderedPageBreak/>
+        <w:t>OR "shortcut learning" OR "spurious correlation" OR "Clever Hans" OR "uninterpretable" OR "</w:t>
       </w:r>
       <w:proofErr w:type="spellStart"/>
       <w:r>
@@ -2673,7 +2644,6 @@
           <w:szCs w:val="20"/>
           <w:lang w:val="en-US"/>
         </w:rPr>
-        <w:lastRenderedPageBreak/>
         <w:t xml:space="preserve">C — </w:t>
       </w:r>
       <w:proofErr w:type="spellStart"/>
@@ -3724,6 +3694,7 @@
           <w:sz w:val="20"/>
           <w:szCs w:val="20"/>
         </w:rPr>
+        <w:lastRenderedPageBreak/>
         <w:t>Tipo de documento (</w:t>
       </w:r>
       <w:proofErr w:type="spellStart"/>
@@ -3856,7 +3827,6 @@
           <w:sz w:val="20"/>
           <w:szCs w:val="20"/>
         </w:rPr>
-        <w:lastRenderedPageBreak/>
         <w:t xml:space="preserve">Tipo de documento (Web </w:t>
       </w:r>
       <w:proofErr w:type="spellStart"/>
@@ -4845,15 +4815,7 @@
           <w:b/>
           <w:bCs/>
         </w:rPr>
-        <w:t>Referencias_seminario</w:t>
-      </w:r>
-      <w:r>
-        <w:rPr>
-          <w:rFonts w:ascii="Times New Roman" w:hAnsi="Times New Roman" w:cs="Times New Roman"/>
-          <w:b/>
-          <w:bCs/>
-        </w:rPr>
-        <w:t>.xlsx</w:t>
+        <w:t>Referencias_seminario.xlsx</w:t>
       </w:r>
       <w:r>
         <w:rPr>
@@ -6039,7 +6001,6 @@
   <w:style w:type="character" w:default="1" w:styleId="DefaultParagraphFont">
     <w:name w:val="Default Paragraph Font"/>
     <w:uiPriority w:val="1"/>
-    <w:semiHidden/>
     <w:unhideWhenUsed/>
   </w:style>
   <w:style w:type="table" w:default="1" w:styleId="TableNormal">

</xml_diff>